<commit_message>
Adicionar rascunho ABCD Form People Lead para Ana Karina
Textos prontos por prioridade, posicionamento de calibração,
impactos sugeridos e checklist até 11/09.

Co-authored-by: Jonatas Andrade <jonatasandradedeveloper@users.noreply.github.com>
</commit_message>
<xml_diff>
--- a/people-lead/word/DOSSIE-ANA-KARINA.docx
+++ b/people-lead/word/DOSSIE-ANA-KARINA.docx
@@ -7895,6 +7895,17 @@
         </w:rPr>
         <w:t>Input PL no ABCD Form — até 11/09</w:t>
       </w:r>
+      <w:r>
+        <w:t xml:space="preserve"> — rascunho: </w:t>
+      </w:r>
+      <w:r>
+        <w:rPr>
+          <w:rFonts w:ascii="Consolas" w:hAnsi="Consolas"/>
+          <w:color w:val="333333"/>
+          <w:sz w:val="18"/>
+        </w:rPr>
+        <w:t>12-abcd-form-people-lead-rascunho.md</w:t>
+      </w:r>
     </w:p>
     <w:p>
       <w:pPr>
@@ -8135,6 +8146,17 @@
           <w:b/>
         </w:rPr>
         <w:t>Input ABCD Form no Workday — até 11/09/2026</w:t>
+      </w:r>
+      <w:r>
+        <w:t xml:space="preserve"> — usar </w:t>
+      </w:r>
+      <w:r>
+        <w:rPr>
+          <w:rFonts w:ascii="Consolas" w:hAnsi="Consolas"/>
+          <w:color w:val="333333"/>
+          <w:sz w:val="18"/>
+        </w:rPr>
+        <w:t>12-abcd-form-people-lead-rascunho.md</w:t>
       </w:r>
     </w:p>
     <w:p>

</xml_diff>